<commit_message>
Fix upload api bug
</commit_message>
<xml_diff>
--- a/plantilla_caja_huancayo.docx
+++ b/plantilla_caja_huancayo.docx
@@ -11,7 +11,10 @@
         <w:spacing w:before="0" w:after="0" w:line="276" w:lineRule="auto"/>
       </w:pPr>
       <w:r>
-        <w:t>Lima, [FECHA_ACTUAL]</w:t>
+        <w:t xml:space="preserve">                                                                                                                          </w:t>
+      </w:r>
+      <w:r>
+        <w:t xml:space="preserve">Lima, </w:t>
       </w:r>
     </w:p>
     <w:p>
@@ -91,7 +94,7 @@
         </w:rPr>
       </w:pPr>
       <w:r>
-        <w:t xml:space="preserve">CUENTA: [NUM_CUENTA]                                                           N° de Carta al cliente: </w:t>
+        <w:t xml:space="preserve">CUENTA: [NUM_CUENTA]                                              N° de Carta al cliente: </w:t>
       </w:r>
     </w:p>
     <w:p>
@@ -366,6 +369,21 @@
         </w:rPr>
         <w:t xml:space="preserve"> </w:t>
       </w:r>
+    </w:p>
+    <w:p>
+      <w:pPr>
+        <w:tabs>
+          <w:tab w:val="left" w:pos="3119"/>
+        </w:tabs>
+        <w:spacing w:after="0" w:line="276" w:lineRule="auto"/>
+        <w:jc w:val="both"/>
+        <w:rPr>
+          <w:rFonts w:ascii="Arial Narrow" w:eastAsia="Times New Roman" w:hAnsi="Arial Narrow" w:cs="Arial"/>
+          <w:b/>
+          <w:sz w:val="24"/>
+          <w:lang w:val="es-ES"/>
+        </w:rPr>
+      </w:pPr>
     </w:p>
     <w:p>
       <w:pPr>
@@ -546,67 +564,6 @@
               </w:rPr>
               <w:t xml:space="preserve"> </w:t>
             </w:r>
-            <w:r>
-              <w:rPr>
-                <w:rFonts w:ascii="Calibri" w:eastAsia="Times New Roman" w:hAnsi="Calibri" w:cs="Calibri"/>
-                <w:b/>
-                <w:bCs/>
-                <w:color w:val="000000"/>
-                <w:sz w:val="48"/>
-                <w:szCs w:val="48"/>
-                <w:lang w:eastAsia="es-PE"/>
-              </w:rPr>
-              <w:fldChar w:fldCharType="begin"/>
-            </w:r>
-            <w:r>
-              <w:rPr>
-                <w:rFonts w:ascii="Calibri" w:eastAsia="Times New Roman" w:hAnsi="Calibri" w:cs="Calibri"/>
-                <w:b/>
-                <w:bCs/>
-                <w:color w:val="000000"/>
-                <w:sz w:val="48"/>
-                <w:szCs w:val="48"/>
-                <w:lang w:eastAsia="es-PE"/>
-              </w:rPr>
-              <w:instrText xml:space="preserve"> MERGEFIELD Saldo_Total </w:instrText>
-            </w:r>
-            <w:r>
-              <w:rPr>
-                <w:rFonts w:ascii="Calibri" w:eastAsia="Times New Roman" w:hAnsi="Calibri" w:cs="Calibri"/>
-                <w:b/>
-                <w:bCs/>
-                <w:color w:val="000000"/>
-                <w:sz w:val="48"/>
-                <w:szCs w:val="48"/>
-                <w:lang w:eastAsia="es-PE"/>
-              </w:rPr>
-              <w:fldChar w:fldCharType="separate"/>
-            </w:r>
-            <w:r>
-              <w:rPr>
-                <w:rFonts w:ascii="Calibri" w:eastAsia="Times New Roman" w:hAnsi="Calibri" w:cs="Calibri"/>
-                <w:b/>
-                <w:bCs/>
-                <w:noProof/>
-                <w:color w:val="000000"/>
-                <w:sz w:val="48"/>
-                <w:szCs w:val="48"/>
-                <w:lang w:eastAsia="es-PE"/>
-              </w:rPr>
-              <w:t>36325.52</w:t>
-            </w:r>
-            <w:r>
-              <w:rPr>
-                <w:rFonts w:ascii="Calibri" w:eastAsia="Times New Roman" w:hAnsi="Calibri" w:cs="Calibri"/>
-                <w:b/>
-                <w:bCs/>
-                <w:color w:val="000000"/>
-                <w:sz w:val="48"/>
-                <w:szCs w:val="48"/>
-                <w:lang w:eastAsia="es-PE"/>
-              </w:rPr>
-              <w:fldChar w:fldCharType="end"/>
-            </w:r>
           </w:p>
         </w:tc>
       </w:tr>
@@ -816,6 +773,19 @@
         <w:spacing w:after="0" w:line="240" w:lineRule="auto"/>
         <w:jc w:val="both"/>
         <w:rPr>
+          <w:rFonts w:ascii="Arial Narrow" w:hAnsi="Arial Narrow" w:cs="Arial"/>
+          <w:noProof/>
+          <w:sz w:val="24"/>
+          <w:szCs w:val="24"/>
+          <w:lang w:eastAsia="es-PE"/>
+        </w:rPr>
+      </w:pPr>
+    </w:p>
+    <w:p>
+      <w:pPr>
+        <w:spacing w:after="0" w:line="240" w:lineRule="auto"/>
+        <w:jc w:val="both"/>
+        <w:rPr>
           <w:rFonts w:ascii="Arial Narrow" w:hAnsi="Arial Narrow" w:cs="Calibri Light"/>
           <w:b/>
           <w:bCs/>
@@ -823,70 +793,71 @@
           <w:szCs w:val="32"/>
         </w:rPr>
       </w:pPr>
-      <w:r>
-        <w:rPr>
-          <w:rFonts w:ascii="Arial Narrow" w:hAnsi="Arial Narrow" w:cs="Arial"/>
+    </w:p>
+    <w:p>
+      <w:pPr>
+        <w:rPr>
+          <w:rFonts w:ascii="Arial Narrow" w:hAnsi="Arial Narrow" w:cs="Calibri Light"/>
+          <w:b/>
+          <w:bCs/>
+          <w:sz w:val="28"/>
+          <w:szCs w:val="28"/>
+        </w:rPr>
+      </w:pPr>
+    </w:p>
+    <w:p>
+      <w:pPr>
+        <w:rPr>
+          <w:rFonts w:ascii="Arial Narrow" w:hAnsi="Arial Narrow" w:cs="Calibri Light"/>
+          <w:b/>
+          <w:bCs/>
+          <w:sz w:val="28"/>
+          <w:szCs w:val="28"/>
+        </w:rPr>
+      </w:pPr>
+    </w:p>
+    <w:p>
+      <w:pPr>
+        <w:rPr>
+          <w:sz w:val="24"/>
+          <w:szCs w:val="24"/>
+        </w:rPr>
+      </w:pPr>
+      <w:r>
+        <w:rPr>
+          <w:sz w:val="24"/>
+          <w:szCs w:val="24"/>
+        </w:rPr>
+        <w:fldChar w:fldCharType="begin"/>
+      </w:r>
+      <w:r>
+        <w:rPr>
+          <w:sz w:val="24"/>
+          <w:szCs w:val="24"/>
+        </w:rPr>
+        <w:instrText xml:space="preserve"> MERGEFIELD CORRELATIVO </w:instrText>
+      </w:r>
+      <w:r>
+        <w:rPr>
+          <w:sz w:val="24"/>
+          <w:szCs w:val="24"/>
+        </w:rPr>
+        <w:fldChar w:fldCharType="separate"/>
+      </w:r>
+      <w:r>
+        <w:rPr>
           <w:noProof/>
           <w:sz w:val="24"/>
           <w:szCs w:val="24"/>
-          <w:lang w:eastAsia="es-PE"/>
-        </w:rPr>
-        <w:drawing>
-          <wp:anchor distT="0" distB="0" distL="114300" distR="114300" simplePos="0" relativeHeight="251658240" behindDoc="0" locked="0" layoutInCell="1" allowOverlap="1" wp14:anchorId="7BE0F8B1" wp14:editId="4E89855D">
-            <wp:simplePos x="0" y="0"/>
-            <wp:positionH relativeFrom="column">
-              <wp:posOffset>2089785</wp:posOffset>
-            </wp:positionH>
-            <wp:positionV relativeFrom="paragraph">
-              <wp:posOffset>125730</wp:posOffset>
-            </wp:positionV>
-            <wp:extent cx="1743075" cy="619125"/>
-            <wp:effectExtent l="0" t="0" r="9525" b="9525"/>
-            <wp:wrapNone/>
-            <wp:docPr id="2" name="Imagen 2" descr="WhatsApp Image 2022-11-03 at 4"/>
-            <wp:cNvGraphicFramePr>
-              <a:graphicFrameLocks xmlns:a="http://schemas.openxmlformats.org/drawingml/2006/main" noChangeAspect="1"/>
-            </wp:cNvGraphicFramePr>
-            <a:graphic xmlns:a="http://schemas.openxmlformats.org/drawingml/2006/main">
-              <a:graphicData uri="http://schemas.openxmlformats.org/drawingml/2006/picture">
-                <pic:pic xmlns:pic="http://schemas.openxmlformats.org/drawingml/2006/picture">
-                  <pic:nvPicPr>
-                    <pic:cNvPr id="0" name="Picture 2" descr="WhatsApp Image 2022-11-03 at 4"/>
-                    <pic:cNvPicPr>
-                      <a:picLocks noChangeAspect="1" noChangeArrowheads="1"/>
-                    </pic:cNvPicPr>
-                  </pic:nvPicPr>
-                  <pic:blipFill>
-                    <a:blip r:embed="rId7">
-                      <a:extLst>
-                        <a:ext uri="{28A0092B-C50C-407E-A947-70E740481C1C}">
-                          <a14:useLocalDpi xmlns:a14="http://schemas.microsoft.com/office/drawing/2010/main" val="0"/>
-                        </a:ext>
-                      </a:extLst>
-                    </a:blip>
-                    <a:srcRect/>
-                    <a:stretch>
-                      <a:fillRect/>
-                    </a:stretch>
-                  </pic:blipFill>
-                  <pic:spPr bwMode="auto">
-                    <a:xfrm>
-                      <a:off x="0" y="0"/>
-                      <a:ext cx="1743075" cy="619125"/>
-                    </a:xfrm>
-                    <a:prstGeom prst="rect">
-                      <a:avLst/>
-                    </a:prstGeom>
-                    <a:noFill/>
-                    <a:ln>
-                      <a:noFill/>
-                    </a:ln>
-                  </pic:spPr>
-                </pic:pic>
-              </a:graphicData>
-            </a:graphic>
-          </wp:anchor>
-        </w:drawing>
+        </w:rPr>
+        <w:t>N° CARTA:1997-2026-CÓDIGO AG. 099 ASESOR LEGAL EXTERNO: LPG/CMACHYO</w:t>
+      </w:r>
+      <w:r>
+        <w:rPr>
+          <w:sz w:val="24"/>
+          <w:szCs w:val="24"/>
+        </w:rPr>
+        <w:fldChar w:fldCharType="end"/>
       </w:r>
     </w:p>
     <w:p>
@@ -900,73 +871,6 @@
         </w:rPr>
       </w:pPr>
     </w:p>
-    <w:p>
-      <w:pPr>
-        <w:rPr>
-          <w:rFonts w:ascii="Arial Narrow" w:hAnsi="Arial Narrow" w:cs="Calibri Light"/>
-          <w:b/>
-          <w:bCs/>
-          <w:sz w:val="28"/>
-          <w:szCs w:val="28"/>
-        </w:rPr>
-      </w:pPr>
-    </w:p>
-    <w:p>
-      <w:pPr>
-        <w:rPr>
-          <w:sz w:val="24"/>
-          <w:szCs w:val="24"/>
-        </w:rPr>
-      </w:pPr>
-      <w:r>
-        <w:rPr>
-          <w:sz w:val="24"/>
-          <w:szCs w:val="24"/>
-        </w:rPr>
-        <w:fldChar w:fldCharType="begin"/>
-      </w:r>
-      <w:r>
-        <w:rPr>
-          <w:sz w:val="24"/>
-          <w:szCs w:val="24"/>
-        </w:rPr>
-        <w:instrText xml:space="preserve"> MERGEFIELD CORRELATIVO </w:instrText>
-      </w:r>
-      <w:r>
-        <w:rPr>
-          <w:sz w:val="24"/>
-          <w:szCs w:val="24"/>
-        </w:rPr>
-        <w:fldChar w:fldCharType="separate"/>
-      </w:r>
-      <w:r>
-        <w:rPr>
-          <w:noProof/>
-          <w:sz w:val="24"/>
-          <w:szCs w:val="24"/>
-        </w:rPr>
-        <w:t>N° CARTA:1997-2026-CÓDIGO AG. 099 ASESOR LEGAL EXTERNO: LPG/CMACHYO</w:t>
-      </w:r>
-      <w:r>
-        <w:rPr>
-          <w:sz w:val="24"/>
-          <w:szCs w:val="24"/>
-        </w:rPr>
-        <w:fldChar w:fldCharType="end"/>
-      </w:r>
-    </w:p>
-    <w:p>
-      <w:pPr>
-        <w:rPr>
-          <w:rFonts w:ascii="Arial Narrow" w:hAnsi="Arial Narrow" w:cs="Calibri Light"/>
-          <w:b/>
-          <w:bCs/>
-          <w:sz w:val="28"/>
-          <w:szCs w:val="28"/>
-        </w:rPr>
-      </w:pPr>
-    </w:p>
-    <w:bookmarkEnd w:id="0"/>
     <w:p>
       <w:r>
         <w:br w:type="page"/>
@@ -1083,26 +987,18 @@
         <w:t>CUENTA:</w:t>
       </w:r>
       <w:r>
-        <w:rPr>
+        <w:t xml:space="preserve"> </w:t>
+      </w:r>
+      <w:r>
+        <w:t xml:space="preserve">[NUM_CUENTA]                </w:t>
+      </w:r>
+      <w:r>
+        <w:rPr>
+          <w:b/>
+          <w:bCs/>
           <w:noProof/>
         </w:rPr>
-        <w:t xml:space="preserve">   </w:t>
-      </w:r>
-      <w:r>
-        <w:rPr>
-          <w:b/>
-          <w:bCs/>
-          <w:noProof/>
-        </w:rPr>
-        <w:t>N° de Carta al cliente: 0</w:t>
-      </w:r>
-      <w:r>
-        <w:rPr>
-          <w:b/>
-          <w:bCs/>
-          <w:noProof/>
-        </w:rPr>
-        <w:t>6</w:t>
+        <w:t xml:space="preserve">N° de Carta al cliente: </w:t>
       </w:r>
     </w:p>
     <w:p>
@@ -1502,7 +1398,6 @@
           <w:p>
             <w:pPr>
               <w:spacing w:after="0" w:line="240" w:lineRule="auto"/>
-              <w:jc w:val="center"/>
               <w:rPr>
                 <w:rFonts w:ascii="Calibri" w:eastAsia="Times New Roman" w:hAnsi="Calibri" w:cs="Calibri"/>
                 <w:b/>
@@ -1523,7 +1418,7 @@
                 <w:szCs w:val="48"/>
                 <w:lang w:eastAsia="es-PE"/>
               </w:rPr>
-              <w:t>S/</w:t>
+              <w:t xml:space="preserve">   </w:t>
             </w:r>
             <w:r>
               <w:rPr>
@@ -1535,56 +1430,7 @@
                 <w:szCs w:val="48"/>
                 <w:lang w:eastAsia="es-PE"/>
               </w:rPr>
-              <w:fldChar w:fldCharType="begin"/>
-            </w:r>
-            <w:r>
-              <w:rPr>
-                <w:rFonts w:ascii="Calibri" w:eastAsia="Times New Roman" w:hAnsi="Calibri" w:cs="Calibri"/>
-                <w:b/>
-                <w:bCs/>
-                <w:color w:val="000000"/>
-                <w:sz w:val="48"/>
-                <w:szCs w:val="48"/>
-                <w:lang w:eastAsia="es-PE"/>
-              </w:rPr>
-              <w:instrText xml:space="preserve"> MERGEFIELD Saldo_Total </w:instrText>
-            </w:r>
-            <w:r>
-              <w:rPr>
-                <w:rFonts w:ascii="Calibri" w:eastAsia="Times New Roman" w:hAnsi="Calibri" w:cs="Calibri"/>
-                <w:b/>
-                <w:bCs/>
-                <w:color w:val="000000"/>
-                <w:sz w:val="48"/>
-                <w:szCs w:val="48"/>
-                <w:lang w:eastAsia="es-PE"/>
-              </w:rPr>
-              <w:fldChar w:fldCharType="separate"/>
-            </w:r>
-            <w:r>
-              <w:rPr>
-                <w:rFonts w:ascii="Calibri" w:eastAsia="Times New Roman" w:hAnsi="Calibri" w:cs="Calibri"/>
-                <w:b/>
-                <w:bCs/>
-                <w:noProof/>
-                <w:color w:val="000000"/>
-                <w:sz w:val="48"/>
-                <w:szCs w:val="48"/>
-                <w:lang w:eastAsia="es-PE"/>
-              </w:rPr>
-              <w:t>36325.52</w:t>
-            </w:r>
-            <w:r>
-              <w:rPr>
-                <w:rFonts w:ascii="Calibri" w:eastAsia="Times New Roman" w:hAnsi="Calibri" w:cs="Calibri"/>
-                <w:b/>
-                <w:bCs/>
-                <w:color w:val="000000"/>
-                <w:sz w:val="48"/>
-                <w:szCs w:val="48"/>
-                <w:lang w:eastAsia="es-PE"/>
-              </w:rPr>
-              <w:fldChar w:fldCharType="end"/>
+              <w:t>S/</w:t>
             </w:r>
           </w:p>
         </w:tc>
@@ -1759,7 +1605,7 @@
           <w:sz w:val="32"/>
           <w:szCs w:val="32"/>
         </w:rPr>
-        <w:t>FECHA ULTIMO PAGO:</w:t>
+        <w:t>FECHA ULTIMO PAGO</w:t>
       </w:r>
       <w:r>
         <w:rPr>
@@ -1769,9 +1615,12 @@
           <w:sz w:val="32"/>
           <w:szCs w:val="32"/>
         </w:rPr>
-        <w:fldChar w:fldCharType="begin"/>
-      </w:r>
-      <w:r>
+        <w:t xml:space="preserve">:  </w:t>
+      </w:r>
+    </w:p>
+    <w:p>
+      <w:pPr>
+        <w:spacing w:after="0" w:line="240" w:lineRule="auto"/>
         <w:rPr>
           <w:rFonts w:ascii="Arial Narrow" w:hAnsi="Arial Narrow" w:cs="Calibri Light"/>
           <w:b/>
@@ -1779,154 +1628,76 @@
           <w:sz w:val="32"/>
           <w:szCs w:val="32"/>
         </w:rPr>
-        <w:instrText xml:space="preserve"> MERGEFIELD Fecha_Ult_Pago </w:instrText>
-      </w:r>
-      <w:r>
-        <w:rPr>
-          <w:rFonts w:ascii="Arial Narrow" w:hAnsi="Arial Narrow" w:cs="Calibri Light"/>
-          <w:b/>
-          <w:bCs/>
-          <w:sz w:val="32"/>
-          <w:szCs w:val="32"/>
+      </w:pPr>
+      <w:r>
+        <w:t xml:space="preserve"> </w:t>
+      </w:r>
+      <w:r>
+        <w:rPr>
+          <w:b/>
+          <w:bCs/>
+          <w:sz w:val="24"/>
+          <w:szCs w:val="24"/>
+        </w:rPr>
+        <w:fldChar w:fldCharType="begin"/>
+      </w:r>
+      <w:r>
+        <w:rPr>
+          <w:b/>
+          <w:bCs/>
+          <w:sz w:val="24"/>
+          <w:szCs w:val="24"/>
+        </w:rPr>
+        <w:instrText xml:space="preserve"> MERGEFIELD CORRELATIVO </w:instrText>
+      </w:r>
+      <w:r>
+        <w:rPr>
+          <w:b/>
+          <w:bCs/>
+          <w:sz w:val="24"/>
+          <w:szCs w:val="24"/>
         </w:rPr>
         <w:fldChar w:fldCharType="separate"/>
       </w:r>
       <w:r>
         <w:rPr>
-          <w:rFonts w:ascii="Arial Narrow" w:hAnsi="Arial Narrow" w:cs="Calibri Light"/>
           <w:b/>
           <w:bCs/>
           <w:noProof/>
-          <w:sz w:val="32"/>
-          <w:szCs w:val="32"/>
-        </w:rPr>
-        <w:t xml:space="preserve"> </w:t>
-      </w:r>
-      <w:r>
-        <w:rPr>
-          <w:rFonts w:ascii="Arial Narrow" w:hAnsi="Arial Narrow" w:cs="Calibri Light"/>
+          <w:sz w:val="24"/>
+          <w:szCs w:val="24"/>
+        </w:rPr>
+        <w:t>N° CARTA:1997-2026-CÓDIGO AG. 099 ASESOR LEGAL EXTERNO: LPG/CMACHYO</w:t>
+      </w:r>
+      <w:r>
+        <w:rPr>
+          <w:b/>
+          <w:bCs/>
+          <w:sz w:val="24"/>
+          <w:szCs w:val="24"/>
+        </w:rPr>
+        <w:fldChar w:fldCharType="end"/>
+      </w:r>
+    </w:p>
+    <w:p>
+      <w:pPr>
+        <w:rPr>
+          <w:b/>
+          <w:bCs/>
+          <w:sz w:val="24"/>
+          <w:szCs w:val="24"/>
+        </w:rPr>
+      </w:pPr>
+      <w:r>
+        <w:rPr>
           <w:b/>
           <w:bCs/>
           <w:noProof/>
-          <w:sz w:val="32"/>
-          <w:szCs w:val="32"/>
-        </w:rPr>
-        <w:t>/</w:t>
-      </w:r>
-      <w:r>
-        <w:rPr>
-          <w:rFonts w:ascii="Arial Narrow" w:hAnsi="Arial Narrow" w:cs="Calibri Light"/>
-          <w:b/>
-          <w:bCs/>
-          <w:noProof/>
-          <w:sz w:val="32"/>
-          <w:szCs w:val="32"/>
-        </w:rPr>
-        <w:t xml:space="preserve"> </w:t>
-      </w:r>
-      <w:r>
-        <w:rPr>
-          <w:rFonts w:ascii="Arial Narrow" w:hAnsi="Arial Narrow" w:cs="Calibri Light"/>
-          <w:b/>
-          <w:bCs/>
-          <w:noProof/>
-          <w:sz w:val="32"/>
-          <w:szCs w:val="32"/>
-        </w:rPr>
-        <w:t>/2026</w:t>
-      </w:r>
-      <w:r>
-        <w:rPr>
-          <w:rFonts w:ascii="Arial Narrow" w:hAnsi="Arial Narrow" w:cs="Calibri Light"/>
-          <w:b/>
-          <w:bCs/>
-          <w:sz w:val="32"/>
-          <w:szCs w:val="32"/>
-        </w:rPr>
-        <w:fldChar w:fldCharType="end"/>
-      </w:r>
-    </w:p>
-    <w:p>
-      <w:pPr>
-        <w:spacing w:after="0" w:line="240" w:lineRule="auto"/>
-        <w:rPr>
-          <w:rFonts w:ascii="Arial Narrow" w:hAnsi="Arial Narrow" w:cs="Calibri Light"/>
-          <w:b/>
-          <w:bCs/>
-          <w:sz w:val="32"/>
-          <w:szCs w:val="32"/>
-        </w:rPr>
-      </w:pPr>
-      <w:r>
-        <w:t xml:space="preserve"> </w:t>
-      </w:r>
-      <w:bookmarkEnd w:id="1"/>
-      <w:r>
-        <w:rPr>
-          <w:b/>
-          <w:bCs/>
           <w:sz w:val="24"/>
           <w:szCs w:val="24"/>
         </w:rPr>
-        <w:fldChar w:fldCharType="begin"/>
-      </w:r>
-      <w:r>
-        <w:rPr>
-          <w:b/>
-          <w:bCs/>
-          <w:sz w:val="24"/>
-          <w:szCs w:val="24"/>
-        </w:rPr>
-        <w:instrText xml:space="preserve"> MERGEFIELD CORRELATIVO </w:instrText>
-      </w:r>
-      <w:r>
-        <w:rPr>
-          <w:b/>
-          <w:bCs/>
-          <w:sz w:val="24"/>
-          <w:szCs w:val="24"/>
-        </w:rPr>
-        <w:fldChar w:fldCharType="separate"/>
-      </w:r>
-      <w:r>
-        <w:rPr>
-          <w:b/>
-          <w:bCs/>
-          <w:noProof/>
-          <w:sz w:val="24"/>
-          <w:szCs w:val="24"/>
-        </w:rPr>
-        <w:t>N° CARTA:1997-2026-CÓDIGO AG. 099 ASESOR LEGAL EXTERNO: LPG/CMACHYO</w:t>
-      </w:r>
-      <w:r>
-        <w:rPr>
-          <w:b/>
-          <w:bCs/>
-          <w:sz w:val="24"/>
-          <w:szCs w:val="24"/>
-        </w:rPr>
-        <w:fldChar w:fldCharType="end"/>
-      </w:r>
-    </w:p>
-    <w:p>
-      <w:pPr>
-        <w:rPr>
-          <w:b/>
-          <w:bCs/>
-          <w:sz w:val="24"/>
-          <w:szCs w:val="24"/>
-        </w:rPr>
-      </w:pPr>
-      <w:r>
-        <w:rPr>
-          <w:b/>
-          <w:bCs/>
-          <w:noProof/>
-          <w:sz w:val="24"/>
-          <w:szCs w:val="24"/>
-        </w:rPr>
         <w:drawing>
-          <wp:anchor distT="0" distB="0" distL="114300" distR="114300" simplePos="0" relativeHeight="251659264" behindDoc="1" locked="0" layoutInCell="1" allowOverlap="1" wp14:anchorId="316599A6" wp14:editId="4DF1FA06">
+          <wp:anchor distT="0" distB="0" distL="114300" distR="114300" simplePos="0" relativeHeight="251659264" behindDoc="1" locked="0" layoutInCell="1" allowOverlap="1" wp14:anchorId="29C62775" wp14:editId="31E47E49">
             <wp:simplePos x="0" y="0"/>
             <wp:positionH relativeFrom="column">
               <wp:posOffset>68580</wp:posOffset>
@@ -1949,7 +1720,7 @@
                     <pic:cNvPicPr/>
                   </pic:nvPicPr>
                   <pic:blipFill>
-                    <a:blip r:embed="rId8">
+                    <a:blip r:embed="rId7">
                       <a:extLst>
                         <a:ext uri="{28A0092B-C50C-407E-A947-70E740481C1C}">
                           <a14:useLocalDpi xmlns:a14="http://schemas.microsoft.com/office/drawing/2010/main" val="0"/>
@@ -2067,8 +1838,8 @@
       </w:pPr>
     </w:p>
     <w:sectPr>
-      <w:headerReference w:type="default" r:id="rId9"/>
-      <w:footerReference w:type="default" r:id="rId10"/>
+      <w:headerReference w:type="default" r:id="rId8"/>
+      <w:footerReference w:type="default" r:id="rId9"/>
       <w:pgSz w:w="11906" w:h="16838"/>
       <w:pgMar w:top="142" w:right="424" w:bottom="0" w:left="567" w:header="708" w:footer="708" w:gutter="0"/>
       <w:pgNumType w:fmt="numberInDash" w:start="1" w:chapStyle="1"/>
@@ -2184,7 +1955,7 @@
         <w:lang w:eastAsia="es-PE"/>
       </w:rPr>
       <w:drawing>
-        <wp:anchor distT="0" distB="0" distL="114300" distR="114300" simplePos="0" relativeHeight="251659264" behindDoc="1" locked="0" layoutInCell="1" allowOverlap="1" wp14:anchorId="2BEA215A" wp14:editId="47447B64">
+        <wp:anchor distT="0" distB="0" distL="114300" distR="114300" simplePos="0" relativeHeight="251659264" behindDoc="1" locked="0" layoutInCell="1" allowOverlap="1" wp14:anchorId="4649B171" wp14:editId="142921BC">
           <wp:simplePos x="0" y="0"/>
           <wp:positionH relativeFrom="margin">
             <wp:posOffset>-128270</wp:posOffset>

</xml_diff>